<commit_message>
site: sync 2026-10-19 17:16
</commit_message>
<xml_diff>
--- a/documents/files/analysis.docx
+++ b/documents/files/analysis.docx
@@ -2,13 +2,28 @@
 <file path=word/document.xml><?xml version="1.0" encoding="utf-8"?>
 <w:document xmlns:w="http://schemas.openxmlformats.org/wordprocessingml/2006/main" xmlns:m="http://schemas.openxmlformats.org/officeDocument/2006/math" xmlns:r="http://schemas.openxmlformats.org/officeDocument/2006/relationships" xmlns:o="urn:schemas-microsoft-com:office:office" xmlns:v="urn:schemas-microsoft-com:vml" xmlns:w10="urn:schemas-microsoft-com:office:word" xmlns:a="http://schemas.openxmlformats.org/drawingml/2006/main" xmlns:pic="http://schemas.openxmlformats.org/drawingml/2006/picture" xmlns:wp="http://schemas.openxmlformats.org/drawingml/2006/wordprocessingDrawing">
   <w:body>
-    <w:bookmarkStart w:id="25" w:name="数据分析"/>
     <w:p>
       <w:pPr>
-        <w:pStyle w:val="Heading1"/>
+        <w:pStyle w:val="Title"/>
       </w:pPr>
       <w:r>
         <w:t xml:space="preserve">数据分析</w:t>
+      </w:r>
+    </w:p>
+    <w:p>
+      <w:pPr>
+        <w:pStyle w:val="Subtitle"/>
+      </w:pPr>
+      <w:r>
+        <w:t xml:space="preserve">实验设置、对照结果与三条结论</w:t>
+      </w:r>
+    </w:p>
+    <w:p>
+      <w:pPr>
+        <w:pStyle w:val="Date"/>
+      </w:pPr>
+      <w:r>
+        <w:t xml:space="preserve">2026-10-19</w:t>
       </w:r>
     </w:p>
     <w:p>
@@ -43,20 +58,22 @@
     <w:tbl>
       <w:tblPr>
         <w:tblStyle w:val="Table"/>
-        <w:tblW w:type="auto" w:w="0"/>
+        <w:tblW w:type="dxa" w:w="9638"/>
         <w:jc w:val="left"/>
         <w:tblLook w:firstRow="1" w:lastRow="0" w:firstColumn="0" w:lastColumn="0" w:noHBand="0" w:noVBand="0" w:val="0020"/>
       </w:tblPr>
       <w:tblGrid>
-        <w:gridCol w:w="3960"/>
-        <w:gridCol w:w="3960"/>
+        <w:gridCol w:w="2599"/>
+        <w:gridCol w:w="7039"/>
       </w:tblGrid>
       <w:tr>
         <w:trPr>
           <w:tblHeader w:val="on"/>
         </w:trPr>
         <w:tc>
-          <w:tcPr/>
+          <w:tcPr>
+            <w:tcW w:w="2599" w:type="dxa"/>
+          </w:tcPr>
           <w:p>
             <w:pPr>
               <w:pStyle w:val="Compact"/>
@@ -68,7 +85,9 @@
           </w:p>
         </w:tc>
         <w:tc>
-          <w:tcPr/>
+          <w:tcPr>
+            <w:tcW w:w="7039" w:type="dxa"/>
+          </w:tcPr>
           <w:p>
             <w:pPr>
               <w:pStyle w:val="Compact"/>
@@ -82,7 +101,9 @@
       </w:tr>
       <w:tr>
         <w:tc>
-          <w:tcPr/>
+          <w:tcPr>
+            <w:tcW w:w="2599" w:type="dxa"/>
+          </w:tcPr>
           <w:p>
             <w:pPr>
               <w:pStyle w:val="Compact"/>
@@ -94,7 +115,9 @@
           </w:p>
         </w:tc>
         <w:tc>
-          <w:tcPr/>
+          <w:tcPr>
+            <w:tcW w:w="7039" w:type="dxa"/>
+          </w:tcPr>
           <w:p>
             <w:pPr>
               <w:pStyle w:val="Compact"/>
@@ -114,7 +137,9 @@
       </w:tr>
       <w:tr>
         <w:tc>
-          <w:tcPr/>
+          <w:tcPr>
+            <w:tcW w:w="2599" w:type="dxa"/>
+          </w:tcPr>
           <w:p>
             <w:pPr>
               <w:pStyle w:val="Compact"/>
@@ -126,7 +151,9 @@
           </w:p>
         </w:tc>
         <w:tc>
-          <w:tcPr/>
+          <w:tcPr>
+            <w:tcW w:w="7039" w:type="dxa"/>
+          </w:tcPr>
           <w:p>
             <w:pPr>
               <w:pStyle w:val="Compact"/>
@@ -140,7 +167,9 @@
       </w:tr>
       <w:tr>
         <w:tc>
-          <w:tcPr/>
+          <w:tcPr>
+            <w:tcW w:w="2599" w:type="dxa"/>
+          </w:tcPr>
           <w:p>
             <w:pPr>
               <w:pStyle w:val="Compact"/>
@@ -152,7 +181,9 @@
           </w:p>
         </w:tc>
         <w:tc>
-          <w:tcPr/>
+          <w:tcPr>
+            <w:tcW w:w="7039" w:type="dxa"/>
+          </w:tcPr>
           <w:p>
             <w:pPr>
               <w:pStyle w:val="Compact"/>
@@ -166,7 +197,9 @@
       </w:tr>
       <w:tr>
         <w:tc>
-          <w:tcPr/>
+          <w:tcPr>
+            <w:tcW w:w="2599" w:type="dxa"/>
+          </w:tcPr>
           <w:p>
             <w:pPr>
               <w:pStyle w:val="Compact"/>
@@ -178,7 +211,9 @@
           </w:p>
         </w:tc>
         <w:tc>
-          <w:tcPr/>
+          <w:tcPr>
+            <w:tcW w:w="7039" w:type="dxa"/>
+          </w:tcPr>
           <w:p>
             <w:pPr>
               <w:pStyle w:val="Compact"/>
@@ -202,7 +237,9 @@
       </w:tr>
       <w:tr>
         <w:tc>
-          <w:tcPr/>
+          <w:tcPr>
+            <w:tcW w:w="2599" w:type="dxa"/>
+          </w:tcPr>
           <w:p>
             <w:pPr>
               <w:pStyle w:val="Compact"/>
@@ -214,7 +251,9 @@
           </w:p>
         </w:tc>
         <w:tc>
-          <w:tcPr/>
+          <w:tcPr>
+            <w:tcW w:w="7039" w:type="dxa"/>
+          </w:tcPr>
           <w:p>
             <w:pPr>
               <w:pStyle w:val="Compact"/>
@@ -228,7 +267,9 @@
       </w:tr>
       <w:tr>
         <w:tc>
-          <w:tcPr/>
+          <w:tcPr>
+            <w:tcW w:w="2599" w:type="dxa"/>
+          </w:tcPr>
           <w:p>
             <w:pPr>
               <w:pStyle w:val="Compact"/>
@@ -240,7 +281,9 @@
           </w:p>
         </w:tc>
         <w:tc>
-          <w:tcPr/>
+          <w:tcPr>
+            <w:tcW w:w="7039" w:type="dxa"/>
+          </w:tcPr>
           <w:p>
             <w:pPr>
               <w:pStyle w:val="Compact"/>
@@ -266,24 +309,26 @@
     <w:tbl>
       <w:tblPr>
         <w:tblStyle w:val="Table"/>
-        <w:tblW w:type="auto" w:w="0"/>
+        <w:tblW w:type="dxa" w:w="9638"/>
         <w:jc w:val="left"/>
         <w:tblLook w:firstRow="1" w:lastRow="0" w:firstColumn="0" w:lastColumn="0" w:noHBand="0" w:noVBand="0" w:val="0020"/>
       </w:tblPr>
       <w:tblGrid>
-        <w:gridCol w:w="1320"/>
-        <w:gridCol w:w="1320"/>
-        <w:gridCol w:w="1320"/>
-        <w:gridCol w:w="1320"/>
-        <w:gridCol w:w="1320"/>
-        <w:gridCol w:w="1320"/>
+        <w:gridCol w:w="2424"/>
+        <w:gridCol w:w="2946"/>
+        <w:gridCol w:w="1008"/>
+        <w:gridCol w:w="1008"/>
+        <w:gridCol w:w="1008"/>
+        <w:gridCol w:w="1244"/>
       </w:tblGrid>
       <w:tr>
         <w:trPr>
           <w:tblHeader w:val="on"/>
         </w:trPr>
         <w:tc>
-          <w:tcPr/>
+          <w:tcPr>
+            <w:tcW w:w="2424" w:type="dxa"/>
+          </w:tcPr>
           <w:p>
             <w:pPr>
               <w:pStyle w:val="Compact"/>
@@ -295,7 +340,9 @@
           </w:p>
         </w:tc>
         <w:tc>
-          <w:tcPr/>
+          <w:tcPr>
+            <w:tcW w:w="2946" w:type="dxa"/>
+          </w:tcPr>
           <w:p>
             <w:pPr>
               <w:pStyle w:val="Compact"/>
@@ -307,7 +354,9 @@
           </w:p>
         </w:tc>
         <w:tc>
-          <w:tcPr/>
+          <w:tcPr>
+            <w:tcW w:w="1008" w:type="dxa"/>
+          </w:tcPr>
           <w:p>
             <w:pPr>
               <w:pStyle w:val="Compact"/>
@@ -319,7 +368,9 @@
           </w:p>
         </w:tc>
         <w:tc>
-          <w:tcPr/>
+          <w:tcPr>
+            <w:tcW w:w="1008" w:type="dxa"/>
+          </w:tcPr>
           <w:p>
             <w:pPr>
               <w:pStyle w:val="Compact"/>
@@ -331,7 +382,9 @@
           </w:p>
         </w:tc>
         <w:tc>
-          <w:tcPr/>
+          <w:tcPr>
+            <w:tcW w:w="1008" w:type="dxa"/>
+          </w:tcPr>
           <w:p>
             <w:pPr>
               <w:pStyle w:val="Compact"/>
@@ -343,7 +396,9 @@
           </w:p>
         </w:tc>
         <w:tc>
-          <w:tcPr/>
+          <w:tcPr>
+            <w:tcW w:w="1244" w:type="dxa"/>
+          </w:tcPr>
           <w:p>
             <w:pPr>
               <w:pStyle w:val="Compact"/>
@@ -357,7 +412,9 @@
       </w:tr>
       <w:tr>
         <w:tc>
-          <w:tcPr/>
+          <w:tcPr>
+            <w:tcW w:w="2424" w:type="dxa"/>
+          </w:tcPr>
           <w:p>
             <w:pPr>
               <w:pStyle w:val="Compact"/>
@@ -372,7 +429,9 @@
           </w:p>
         </w:tc>
         <w:tc>
-          <w:tcPr/>
+          <w:tcPr>
+            <w:tcW w:w="2946" w:type="dxa"/>
+          </w:tcPr>
           <w:p>
             <w:pPr>
               <w:pStyle w:val="Compact"/>
@@ -384,7 +443,9 @@
           </w:p>
         </w:tc>
         <w:tc>
-          <w:tcPr/>
+          <w:tcPr>
+            <w:tcW w:w="1008" w:type="dxa"/>
+          </w:tcPr>
           <w:p>
             <w:pPr>
               <w:pStyle w:val="Compact"/>
@@ -396,7 +457,9 @@
           </w:p>
         </w:tc>
         <w:tc>
-          <w:tcPr/>
+          <w:tcPr>
+            <w:tcW w:w="1008" w:type="dxa"/>
+          </w:tcPr>
           <w:p>
             <w:pPr>
               <w:pStyle w:val="Compact"/>
@@ -408,7 +471,9 @@
           </w:p>
         </w:tc>
         <w:tc>
-          <w:tcPr/>
+          <w:tcPr>
+            <w:tcW w:w="1008" w:type="dxa"/>
+          </w:tcPr>
           <w:p>
             <w:pPr>
               <w:pStyle w:val="Compact"/>
@@ -420,7 +485,9 @@
           </w:p>
         </w:tc>
         <w:tc>
-          <w:tcPr/>
+          <w:tcPr>
+            <w:tcW w:w="1244" w:type="dxa"/>
+          </w:tcPr>
           <w:p>
             <w:pPr>
               <w:pStyle w:val="Compact"/>
@@ -434,7 +501,9 @@
       </w:tr>
       <w:tr>
         <w:tc>
-          <w:tcPr/>
+          <w:tcPr>
+            <w:tcW w:w="2424" w:type="dxa"/>
+          </w:tcPr>
           <w:p>
             <w:pPr>
               <w:pStyle w:val="Compact"/>
@@ -449,7 +518,9 @@
           </w:p>
         </w:tc>
         <w:tc>
-          <w:tcPr/>
+          <w:tcPr>
+            <w:tcW w:w="2946" w:type="dxa"/>
+          </w:tcPr>
           <w:p>
             <w:pPr>
               <w:pStyle w:val="Compact"/>
@@ -461,7 +532,9 @@
           </w:p>
         </w:tc>
         <w:tc>
-          <w:tcPr/>
+          <w:tcPr>
+            <w:tcW w:w="1008" w:type="dxa"/>
+          </w:tcPr>
           <w:p>
             <w:pPr>
               <w:pStyle w:val="Compact"/>
@@ -473,7 +546,9 @@
           </w:p>
         </w:tc>
         <w:tc>
-          <w:tcPr/>
+          <w:tcPr>
+            <w:tcW w:w="1008" w:type="dxa"/>
+          </w:tcPr>
           <w:p>
             <w:pPr>
               <w:pStyle w:val="Compact"/>
@@ -485,7 +560,9 @@
           </w:p>
         </w:tc>
         <w:tc>
-          <w:tcPr/>
+          <w:tcPr>
+            <w:tcW w:w="1008" w:type="dxa"/>
+          </w:tcPr>
           <w:p>
             <w:pPr>
               <w:pStyle w:val="Compact"/>
@@ -497,7 +574,9 @@
           </w:p>
         </w:tc>
         <w:tc>
-          <w:tcPr/>
+          <w:tcPr>
+            <w:tcW w:w="1244" w:type="dxa"/>
+          </w:tcPr>
           <w:p>
             <w:pPr>
               <w:pStyle w:val="Compact"/>
@@ -511,7 +590,9 @@
       </w:tr>
       <w:tr>
         <w:tc>
-          <w:tcPr/>
+          <w:tcPr>
+            <w:tcW w:w="2424" w:type="dxa"/>
+          </w:tcPr>
           <w:p>
             <w:pPr>
               <w:pStyle w:val="Compact"/>
@@ -526,7 +607,9 @@
           </w:p>
         </w:tc>
         <w:tc>
-          <w:tcPr/>
+          <w:tcPr>
+            <w:tcW w:w="2946" w:type="dxa"/>
+          </w:tcPr>
           <w:p>
             <w:pPr>
               <w:pStyle w:val="Compact"/>
@@ -548,7 +631,9 @@
           </w:p>
         </w:tc>
         <w:tc>
-          <w:tcPr/>
+          <w:tcPr>
+            <w:tcW w:w="1008" w:type="dxa"/>
+          </w:tcPr>
           <w:p>
             <w:pPr>
               <w:pStyle w:val="Compact"/>
@@ -560,7 +645,9 @@
           </w:p>
         </w:tc>
         <w:tc>
-          <w:tcPr/>
+          <w:tcPr>
+            <w:tcW w:w="1008" w:type="dxa"/>
+          </w:tcPr>
           <w:p>
             <w:pPr>
               <w:pStyle w:val="Compact"/>
@@ -572,7 +659,9 @@
           </w:p>
         </w:tc>
         <w:tc>
-          <w:tcPr/>
+          <w:tcPr>
+            <w:tcW w:w="1008" w:type="dxa"/>
+          </w:tcPr>
           <w:p>
             <w:pPr>
               <w:pStyle w:val="Compact"/>
@@ -584,7 +673,9 @@
           </w:p>
         </w:tc>
         <w:tc>
-          <w:tcPr/>
+          <w:tcPr>
+            <w:tcW w:w="1244" w:type="dxa"/>
+          </w:tcPr>
           <w:p>
             <w:pPr>
               <w:pStyle w:val="Compact"/>
@@ -602,7 +693,9 @@
       </w:tr>
       <w:tr>
         <w:tc>
-          <w:tcPr/>
+          <w:tcPr>
+            <w:tcW w:w="2424" w:type="dxa"/>
+          </w:tcPr>
           <w:p>
             <w:pPr>
               <w:pStyle w:val="Compact"/>
@@ -617,7 +710,9 @@
           </w:p>
         </w:tc>
         <w:tc>
-          <w:tcPr/>
+          <w:tcPr>
+            <w:tcW w:w="2946" w:type="dxa"/>
+          </w:tcPr>
           <w:p>
             <w:pPr>
               <w:pStyle w:val="Compact"/>
@@ -645,7 +740,9 @@
           </w:p>
         </w:tc>
         <w:tc>
-          <w:tcPr/>
+          <w:tcPr>
+            <w:tcW w:w="1008" w:type="dxa"/>
+          </w:tcPr>
           <w:p>
             <w:pPr>
               <w:pStyle w:val="Compact"/>
@@ -661,7 +758,9 @@
           </w:p>
         </w:tc>
         <w:tc>
-          <w:tcPr/>
+          <w:tcPr>
+            <w:tcW w:w="1008" w:type="dxa"/>
+          </w:tcPr>
           <w:p>
             <w:pPr>
               <w:pStyle w:val="Compact"/>
@@ -677,7 +776,9 @@
           </w:p>
         </w:tc>
         <w:tc>
-          <w:tcPr/>
+          <w:tcPr>
+            <w:tcW w:w="1008" w:type="dxa"/>
+          </w:tcPr>
           <w:p>
             <w:pPr>
               <w:pStyle w:val="Compact"/>
@@ -693,7 +794,9 @@
           </w:p>
         </w:tc>
         <w:tc>
-          <w:tcPr/>
+          <w:tcPr>
+            <w:tcW w:w="1244" w:type="dxa"/>
+          </w:tcPr>
           <w:p>
             <w:pPr>
               <w:pStyle w:val="Compact"/>
@@ -707,7 +810,120 @@
       </w:tr>
       <w:tr>
         <w:tc>
-          <w:tcPr/>
+          <w:tcPr>
+            <w:tcW w:w="2424" w:type="dxa"/>
+          </w:tcPr>
+          <w:p>
+            <w:pPr>
+              <w:pStyle w:val="Compact"/>
+              <w:jc w:val="left"/>
+            </w:pPr>
+            <w:r>
+              <w:rPr>
+                <w:rStyle w:val="VerbatimChar"/>
+              </w:rPr>
+              <w:t xml:space="preserve">a3_b10_e25</w:t>
+            </w:r>
+          </w:p>
+        </w:tc>
+        <w:tc>
+          <w:tcPr>
+            <w:tcW w:w="2946" w:type="dxa"/>
+          </w:tcPr>
+          <w:p>
+            <w:pPr>
+              <w:pStyle w:val="Compact"/>
+              <w:jc w:val="left"/>
+            </w:pPr>
+            <w:r>
+              <w:t xml:space="preserve">Ascend910 ·</w:t>
+            </w:r>
+            <w:r>
+              <w:t xml:space="preserve"> </w:t>
+            </w:r>
+            <w:r>
+              <w:rPr>
+                <w:b/>
+                <w:bCs/>
+              </w:rPr>
+              <w:t xml:space="preserve">10 blocks · 25 ep</w:t>
+            </w:r>
+          </w:p>
+        </w:tc>
+        <w:tc>
+          <w:tcPr>
+            <w:tcW w:w="1008" w:type="dxa"/>
+          </w:tcPr>
+          <w:p>
+            <w:pPr>
+              <w:pStyle w:val="Compact"/>
+              <w:jc w:val="right"/>
+            </w:pPr>
+            <w:r>
+              <w:rPr>
+                <w:b/>
+                <w:bCs/>
+              </w:rPr>
+              <w:t xml:space="preserve">0.7460</w:t>
+            </w:r>
+          </w:p>
+        </w:tc>
+        <w:tc>
+          <w:tcPr>
+            <w:tcW w:w="1008" w:type="dxa"/>
+          </w:tcPr>
+          <w:p>
+            <w:pPr>
+              <w:pStyle w:val="Compact"/>
+              <w:jc w:val="right"/>
+            </w:pPr>
+            <w:r>
+              <w:rPr>
+                <w:b/>
+                <w:bCs/>
+              </w:rPr>
+              <w:t xml:space="preserve">0.7628</w:t>
+            </w:r>
+          </w:p>
+        </w:tc>
+        <w:tc>
+          <w:tcPr>
+            <w:tcW w:w="1008" w:type="dxa"/>
+          </w:tcPr>
+          <w:p>
+            <w:pPr>
+              <w:pStyle w:val="Compact"/>
+              <w:jc w:val="right"/>
+            </w:pPr>
+            <w:r>
+              <w:rPr>
+                <w:b/>
+                <w:bCs/>
+              </w:rPr>
+              <w:t xml:space="preserve">0.7941</w:t>
+            </w:r>
+          </w:p>
+        </w:tc>
+        <w:tc>
+          <w:tcPr>
+            <w:tcW w:w="1244" w:type="dxa"/>
+          </w:tcPr>
+          <w:p>
+            <w:pPr>
+              <w:pStyle w:val="Compact"/>
+              <w:jc w:val="right"/>
+            </w:pPr>
+            <w:r>
+              <w:t xml:space="preserve">14.6 min</w:t>
+            </w:r>
+          </w:p>
+        </w:tc>
+      </w:tr>
+      <w:tr>
+        <w:tc>
+          <w:tcPr>
+            <w:tcW w:w="2424" w:type="dxa"/>
+          </w:tcPr>
           <w:p>
             <w:pPr>
               <w:pStyle w:val="Compact"/>
@@ -722,7 +938,9 @@
           </w:p>
         </w:tc>
         <w:tc>
-          <w:tcPr/>
+          <w:tcPr>
+            <w:tcW w:w="2946" w:type="dxa"/>
+          </w:tcPr>
           <w:p>
             <w:pPr>
               <w:pStyle w:val="Compact"/>
@@ -734,7 +952,9 @@
           </w:p>
         </w:tc>
         <w:tc>
-          <w:tcPr/>
+          <w:tcPr>
+            <w:tcW w:w="1008" w:type="dxa"/>
+          </w:tcPr>
           <w:p>
             <w:pPr>
               <w:pStyle w:val="Compact"/>
@@ -746,7 +966,9 @@
           </w:p>
         </w:tc>
         <w:tc>
-          <w:tcPr/>
+          <w:tcPr>
+            <w:tcW w:w="1008" w:type="dxa"/>
+          </w:tcPr>
           <w:p>
             <w:pPr>
               <w:pStyle w:val="Compact"/>
@@ -758,7 +980,9 @@
           </w:p>
         </w:tc>
         <w:tc>
-          <w:tcPr/>
+          <w:tcPr>
+            <w:tcW w:w="1008" w:type="dxa"/>
+          </w:tcPr>
           <w:p>
             <w:pPr>
               <w:pStyle w:val="Compact"/>
@@ -770,7 +994,9 @@
           </w:p>
         </w:tc>
         <w:tc>
-          <w:tcPr/>
+          <w:tcPr>
+            <w:tcW w:w="1244" w:type="dxa"/>
+          </w:tcPr>
           <w:p>
             <w:pPr>
               <w:pStyle w:val="Compact"/>
@@ -865,6 +1091,25 @@
         <w:t xml:space="preserve">：单纯把 epoch 加到 50、batch 加到 32 会掉 0.008–0.014，因为 Eq. 35 的学习率日程仍按 25 epoch 下降；加深到 10 blocks 则稳定提升 0.02–0.04。</w:t>
       </w:r>
     </w:p>
+    <w:p>
+      <w:pPr>
+        <w:pStyle w:val="Compact"/>
+        <w:numPr>
+          <w:ilvl w:val="0"/>
+          <w:numId w:val="1001"/>
+        </w:numPr>
+      </w:pPr>
+      <w:r>
+        <w:rPr>
+          <w:b/>
+          <w:bCs/>
+        </w:rPr>
+        <w:t xml:space="preserve">10 blocks 在第 15 轮后基本饱和</w:t>
+      </w:r>
+      <w:r>
+        <w:t xml:space="preserve">：从 15 轮拉到 25 轮，L=9 只涨 0.0034、L=121 只涨 0.0025，耗时却从 7.9 min 变 14.6 min。要再提升应换方向（15 blocks 或重标定学习率日程），而不是继续加 epoch。</w:t>
+      </w:r>
+    </w:p>
     <w:bookmarkEnd w:id="22"/>
     <w:bookmarkStart w:id="23" w:name="类别层面"/>
     <w:p>
@@ -878,21 +1123,23 @@
     <w:tbl>
       <w:tblPr>
         <w:tblStyle w:val="Table"/>
-        <w:tblW w:type="auto" w:w="0"/>
+        <w:tblW w:type="dxa" w:w="9638"/>
         <w:jc w:val="left"/>
         <w:tblLook w:firstRow="1" w:lastRow="0" w:firstColumn="0" w:lastColumn="0" w:noHBand="0" w:noVBand="0" w:val="0020"/>
       </w:tblPr>
       <w:tblGrid>
-        <w:gridCol w:w="2640"/>
-        <w:gridCol w:w="2640"/>
-        <w:gridCol w:w="2640"/>
+        <w:gridCol w:w="1412"/>
+        <w:gridCol w:w="5086"/>
+        <w:gridCol w:w="3140"/>
       </w:tblGrid>
       <w:tr>
         <w:trPr>
           <w:tblHeader w:val="on"/>
         </w:trPr>
         <w:tc>
-          <w:tcPr/>
+          <w:tcPr>
+            <w:tcW w:w="1412" w:type="dxa"/>
+          </w:tcPr>
           <w:p>
             <w:pPr>
               <w:pStyle w:val="Compact"/>
@@ -904,7 +1151,9 @@
           </w:p>
         </w:tc>
         <w:tc>
-          <w:tcPr/>
+          <w:tcPr>
+            <w:tcW w:w="5086" w:type="dxa"/>
+          </w:tcPr>
           <w:p>
             <w:pPr>
               <w:pStyle w:val="Compact"/>
@@ -916,7 +1165,9 @@
           </w:p>
         </w:tc>
         <w:tc>
-          <w:tcPr/>
+          <w:tcPr>
+            <w:tcW w:w="3140" w:type="dxa"/>
+          </w:tcPr>
           <w:p>
             <w:pPr>
               <w:pStyle w:val="Compact"/>
@@ -930,7 +1181,9 @@
       </w:tr>
       <w:tr>
         <w:tc>
-          <w:tcPr/>
+          <w:tcPr>
+            <w:tcW w:w="1412" w:type="dxa"/>
+          </w:tcPr>
           <w:p>
             <w:pPr>
               <w:pStyle w:val="Compact"/>
@@ -942,7 +1195,9 @@
           </w:p>
         </w:tc>
         <w:tc>
-          <w:tcPr/>
+          <w:tcPr>
+            <w:tcW w:w="5086" w:type="dxa"/>
+          </w:tcPr>
           <w:p>
             <w:pPr>
               <w:pStyle w:val="Compact"/>
@@ -954,7 +1209,9 @@
           </w:p>
         </w:tc>
         <w:tc>
-          <w:tcPr/>
+          <w:tcPr>
+            <w:tcW w:w="3140" w:type="dxa"/>
+          </w:tcPr>
           <w:p>
             <w:pPr>
               <w:pStyle w:val="Compact"/>
@@ -968,7 +1225,9 @@
       </w:tr>
       <w:tr>
         <w:tc>
-          <w:tcPr/>
+          <w:tcPr>
+            <w:tcW w:w="1412" w:type="dxa"/>
+          </w:tcPr>
           <w:p>
             <w:pPr>
               <w:pStyle w:val="Compact"/>
@@ -980,7 +1239,9 @@
           </w:p>
         </w:tc>
         <w:tc>
-          <w:tcPr/>
+          <w:tcPr>
+            <w:tcW w:w="5086" w:type="dxa"/>
+          </w:tcPr>
           <w:p>
             <w:pPr>
               <w:pStyle w:val="Compact"/>
@@ -992,7 +1253,9 @@
           </w:p>
         </w:tc>
         <w:tc>
-          <w:tcPr/>
+          <w:tcPr>
+            <w:tcW w:w="3140" w:type="dxa"/>
+          </w:tcPr>
           <w:p>
             <w:pPr>
               <w:pStyle w:val="Compact"/>
@@ -1006,7 +1269,9 @@
       </w:tr>
       <w:tr>
         <w:tc>
-          <w:tcPr/>
+          <w:tcPr>
+            <w:tcW w:w="1412" w:type="dxa"/>
+          </w:tcPr>
           <w:p>
             <w:pPr>
               <w:pStyle w:val="Compact"/>
@@ -1018,7 +1283,9 @@
           </w:p>
         </w:tc>
         <w:tc>
-          <w:tcPr/>
+          <w:tcPr>
+            <w:tcW w:w="5086" w:type="dxa"/>
+          </w:tcPr>
           <w:p>
             <w:pPr>
               <w:pStyle w:val="Compact"/>
@@ -1030,7 +1297,9 @@
           </w:p>
         </w:tc>
         <w:tc>
-          <w:tcPr/>
+          <w:tcPr>
+            <w:tcW w:w="3140" w:type="dxa"/>
+          </w:tcPr>
           <w:p>
             <w:pPr>
               <w:pStyle w:val="Compact"/>
@@ -1044,7 +1313,9 @@
       </w:tr>
       <w:tr>
         <w:tc>
-          <w:tcPr/>
+          <w:tcPr>
+            <w:tcW w:w="1412" w:type="dxa"/>
+          </w:tcPr>
           <w:p>
             <w:pPr>
               <w:pStyle w:val="Compact"/>
@@ -1056,7 +1327,9 @@
           </w:p>
         </w:tc>
         <w:tc>
-          <w:tcPr/>
+          <w:tcPr>
+            <w:tcW w:w="5086" w:type="dxa"/>
+          </w:tcPr>
           <w:p>
             <w:pPr>
               <w:pStyle w:val="Compact"/>
@@ -1068,7 +1341,9 @@
           </w:p>
         </w:tc>
         <w:tc>
-          <w:tcPr/>
+          <w:tcPr>
+            <w:tcW w:w="3140" w:type="dxa"/>
+          </w:tcPr>
           <w:p>
             <w:pPr>
               <w:pStyle w:val="Compact"/>
@@ -1450,14 +1725,42 @@
       </w:r>
     </w:p>
     <w:bookmarkEnd w:id="24"/>
-    <w:bookmarkEnd w:id="25"/>
-    <w:sectPr/>
+    <w:sectPr>
+      <w:footerReference w:type="default" r:id="rId9"/>
+    </w:sectPr>
   </w:body>
 </w:document>
 </file>
 
 <file path=word/comments.xml><?xml version="1.0" encoding="utf-8"?>
 <w:comments xmlns:w="http://schemas.openxmlformats.org/wordprocessingml/2006/main" xmlns:m="http://schemas.openxmlformats.org/officeDocument/2006/math" xmlns:r="http://schemas.openxmlformats.org/officeDocument/2006/relationships" xmlns:o="urn:schemas-microsoft-com:office:office" xmlns:v="urn:schemas-microsoft-com:vml" xmlns:w10="urn:schemas-microsoft-com:office:word" xmlns:a="http://schemas.openxmlformats.org/drawingml/2006/main" xmlns:pic="http://schemas.openxmlformats.org/drawingml/2006/picture" xmlns:wp="http://schemas.openxmlformats.org/drawingml/2006/wordprocessingDrawing"/>
+</file>
+
+<file path=word/footer1.xml><?xml version="1.0" encoding="utf-8"?>
+<w:ftr xmlns:w="http://schemas.openxmlformats.org/wordprocessingml/2006/main">
+  <w:p>
+    <w:pPr>
+      <w:jc w:val="center"/>
+      <w:spacing w:before="0" w:after="0"/>
+    </w:pPr>
+    <w:r>
+      <w:rPr>
+        <w:color w:val="9A9A9A"/>
+        <w:sz w:val="16"/>
+      </w:rPr>
+      <w:t xml:space="preserve">InSAR_affair  ·  </w:t>
+    </w:r>
+    <w:fldSimple w:instr=" PAGE ">
+      <w:r>
+        <w:rPr>
+          <w:color w:val="9A9A9A"/>
+          <w:sz w:val="16"/>
+        </w:rPr>
+        <w:t>1</w:t>
+      </w:r>
+    </w:fldSimple>
+  </w:p>
+</w:ftr>
 </file>
 
 <file path=word/footnotes.xml><?xml version="1.0" encoding="utf-8"?>
@@ -1683,10 +1986,10 @@
   <w:docDefaults>
     <w:rPrDefault>
       <w:rPr>
-        <w:rFonts w:asciiTheme="minorHAnsi" w:cstheme="minorBidi" w:eastAsiaTheme="minorHAnsi" w:hAnsiTheme="minorHAnsi"/>
+        <w:rFonts w:ascii="Calibri" w:cs="Calibri" w:eastAsia="微软雅黑" w:hAnsi="Calibri"/>
         <w:sz w:val="24"/>
         <w:szCs w:val="24"/>
-        <w:lang w:bidi="ar-SA" w:eastAsia="en-US" w:val="en-US"/>
+        <w:lang w:bidi="ar-SA" w:eastAsia="zh-CN" w:val="en-US"/>
       </w:rPr>
     </w:rPrDefault>
     <w:pPrDefault>
@@ -1703,11 +2006,17 @@
   <w:style w:styleId="BodyText" w:type="paragraph">
     <w:name w:val="Body Text"/>
     <w:basedOn w:val="Normal"/>
-    <w:link w:val="BodyTextChar"/>
+    <w:next w:val="Normal"/>
     <w:qFormat/>
     <w:pPr>
-      <w:spacing w:after="180" w:before="180"/>
+      <w:spacing w:after="140" w:before="0" w:line="300" w:lineRule="auto"/>
     </w:pPr>
+    <w:rPr>
+      <w:rFonts w:ascii="Calibri" w:cs="Calibri" w:eastAsia="微软雅黑" w:hAnsi="Calibri"/>
+      <w:color w:val="1B2A33"/>
+      <w:sz w:val="21"/>
+      <w:szCs w:val="21"/>
+    </w:rPr>
   </w:style>
   <w:style w:customStyle="1" w:styleId="FirstParagraph" w:type="paragraph">
     <w:name w:val="First Paragraph"/>
@@ -1726,37 +2035,37 @@
   <w:style w:styleId="Title" w:type="paragraph">
     <w:name w:val="Title"/>
     <w:basedOn w:val="Normal"/>
-    <w:next w:val="BodyText"/>
+    <w:next w:val="Normal"/>
     <w:qFormat/>
     <w:pPr>
       <w:keepNext/>
-      <w:keepLines/>
-      <w:spacing w:after="240" w:before="480"/>
-      <w:jc w:val="center"/>
+      <w:spacing w:after="80" w:before="0"/>
     </w:pPr>
     <w:rPr>
-      <w:rFonts w:asciiTheme="majorHAnsi" w:cstheme="majorBidi" w:eastAsiaTheme="majorEastAsia" w:hAnsiTheme="majorHAnsi"/>
+      <w:rFonts w:ascii="Calibri" w:cs="Calibri" w:eastAsia="微软雅黑" w:hAnsi="Calibri"/>
       <w:b/>
       <w:bCs/>
-      <w:color w:themeColor="accent1" w:themeShade="B5" w:val="345A8A"/>
-      <w:sz w:val="36"/>
-      <w:szCs w:val="36"/>
+      <w:color w:val="1B2A33"/>
+      <w:sz w:val="40"/>
+      <w:szCs w:val="40"/>
     </w:rPr>
   </w:style>
   <w:style w:styleId="Subtitle" w:type="paragraph">
     <w:name w:val="Subtitle"/>
-    <w:basedOn w:val="Title"/>
-    <w:next w:val="BodyText"/>
+    <w:basedOn w:val="Normal"/>
+    <w:next w:val="Normal"/>
     <w:qFormat/>
     <w:pPr>
-      <w:keepNext/>
-      <w:keepLines/>
-      <w:spacing w:after="240" w:before="240"/>
-      <w:jc w:val="center"/>
+      <w:spacing w:after="200" w:before="0"/>
+      <w:pBdr>
+        <w:bottom w:color="D3CCBB" w:space="6" w:sz="6" w:val="single"/>
+      </w:pBdr>
     </w:pPr>
     <w:rPr>
-      <w:sz w:val="30"/>
-      <w:szCs w:val="30"/>
+      <w:rFonts w:ascii="Calibri" w:cs="Calibri" w:eastAsia="微软雅黑" w:hAnsi="Calibri"/>
+      <w:color w:val="6E6A60"/>
+      <w:sz w:val="20"/>
+      <w:szCs w:val="20"/>
     </w:rPr>
   </w:style>
   <w:style w:customStyle="1" w:styleId="Author" w:type="paragraph">
@@ -1771,13 +2080,18 @@
   </w:style>
   <w:style w:styleId="Date" w:type="paragraph">
     <w:name w:val="Date"/>
-    <w:next w:val="BodyText"/>
+    <w:basedOn w:val="Normal"/>
+    <w:next w:val="Normal"/>
     <w:qFormat/>
     <w:pPr>
-      <w:keepNext/>
-      <w:keepLines/>
-      <w:jc w:val="center"/>
+      <w:spacing w:after="320" w:before="0"/>
     </w:pPr>
+    <w:rPr>
+      <w:rFonts w:ascii="Calibri" w:cs="Calibri" w:eastAsia="微软雅黑" w:hAnsi="Calibri"/>
+      <w:color w:val="6E6A60"/>
+      <w:sz w:val="18"/>
+      <w:szCs w:val="18"/>
+    </w:rPr>
   </w:style>
   <w:style w:customStyle="1" w:styleId="AbstractTitle" w:type="paragraph">
     <w:name w:val="Abstract Title"/>
@@ -1821,131 +2135,114 @@
     <w:rPr/>
   </w:style>
   <w:style w:styleId="Heading1" w:type="paragraph">
-    <w:name w:val="Heading 1"/>
+    <w:name w:val="heading 1"/>
     <w:basedOn w:val="Normal"/>
-    <w:next w:val="BodyText"/>
-    <w:uiPriority w:val="9"/>
+    <w:next w:val="Normal"/>
     <w:qFormat/>
     <w:pPr>
       <w:keepNext/>
-      <w:keepLines/>
-      <w:spacing w:after="0" w:before="480"/>
-      <w:outlineLvl w:val="0"/>
+      <w:spacing w:after="140" w:before="440"/>
+      <w:pBdr>
+        <w:bottom w:color="D3CCBB" w:space="6" w:sz="6" w:val="single"/>
+      </w:pBdr>
     </w:pPr>
     <w:rPr>
-      <w:rFonts w:asciiTheme="majorHAnsi" w:cstheme="majorBidi" w:eastAsiaTheme="majorEastAsia" w:hAnsiTheme="majorHAnsi"/>
+      <w:rFonts w:ascii="Calibri" w:cs="Calibri" w:eastAsia="微软雅黑" w:hAnsi="Calibri"/>
       <w:b/>
       <w:bCs/>
-      <w:color w:themeColor="accent1" w:val="4F81BD"/>
-      <w:sz w:val="32"/>
-      <w:szCs w:val="32"/>
+      <w:color w:val="1B2A33"/>
+      <w:sz w:val="30"/>
+      <w:szCs w:val="30"/>
     </w:rPr>
   </w:style>
   <w:style w:styleId="Heading2" w:type="paragraph">
-    <w:name w:val="Heading 2"/>
+    <w:name w:val="heading 2"/>
     <w:basedOn w:val="Normal"/>
-    <w:next w:val="BodyText"/>
-    <w:uiPriority w:val="9"/>
-    <w:unhideWhenUsed/>
+    <w:next w:val="Normal"/>
     <w:qFormat/>
     <w:pPr>
       <w:keepNext/>
-      <w:keepLines/>
-      <w:spacing w:after="0" w:before="200"/>
-      <w:outlineLvl w:val="1"/>
+      <w:spacing w:after="100" w:before="320"/>
     </w:pPr>
     <w:rPr>
-      <w:rFonts w:asciiTheme="majorHAnsi" w:cstheme="majorBidi" w:eastAsiaTheme="majorEastAsia" w:hAnsiTheme="majorHAnsi"/>
+      <w:rFonts w:ascii="Calibri" w:cs="Calibri" w:eastAsia="微软雅黑" w:hAnsi="Calibri"/>
       <w:b/>
       <w:bCs/>
-      <w:color w:themeColor="accent1" w:val="4F81BD"/>
-      <w:sz w:val="28"/>
-      <w:szCs w:val="28"/>
+      <w:color w:val="1B2A33"/>
+      <w:sz w:val="24"/>
+      <w:szCs w:val="24"/>
     </w:rPr>
   </w:style>
   <w:style w:styleId="Heading3" w:type="paragraph">
-    <w:name w:val="Heading 3"/>
+    <w:name w:val="heading 3"/>
     <w:basedOn w:val="Normal"/>
-    <w:next w:val="BodyText"/>
-    <w:uiPriority w:val="9"/>
-    <w:unhideWhenUsed/>
+    <w:next w:val="Normal"/>
     <w:qFormat/>
     <w:pPr>
       <w:keepNext/>
-      <w:keepLines/>
-      <w:spacing w:after="0" w:before="200"/>
-      <w:outlineLvl w:val="2"/>
+      <w:spacing w:after="80" w:before="260"/>
     </w:pPr>
     <w:rPr>
-      <w:rFonts w:asciiTheme="majorHAnsi" w:cstheme="majorBidi" w:eastAsiaTheme="majorEastAsia" w:hAnsiTheme="majorHAnsi"/>
+      <w:rFonts w:ascii="Calibri" w:cs="Calibri" w:eastAsia="微软雅黑" w:hAnsi="Calibri"/>
       <w:b/>
       <w:bCs/>
-      <w:color w:themeColor="accent1" w:val="4F81BD"/>
-      <w:sz w:val="24"/>
-      <w:szCs w:val="24"/>
+      <w:color w:val="333333"/>
+      <w:sz w:val="21"/>
+      <w:szCs w:val="21"/>
     </w:rPr>
   </w:style>
   <w:style w:styleId="Heading4" w:type="paragraph">
-    <w:name w:val="Heading 4"/>
+    <w:name w:val="heading 4"/>
     <w:basedOn w:val="Normal"/>
-    <w:next w:val="BodyText"/>
-    <w:uiPriority w:val="9"/>
-    <w:unhideWhenUsed/>
+    <w:next w:val="Normal"/>
     <w:qFormat/>
     <w:pPr>
       <w:keepNext/>
-      <w:keepLines/>
-      <w:spacing w:after="0" w:before="200"/>
-      <w:outlineLvl w:val="3"/>
+      <w:spacing w:after="60" w:before="220"/>
     </w:pPr>
     <w:rPr>
-      <w:rFonts w:asciiTheme="majorHAnsi" w:cstheme="majorBidi" w:eastAsiaTheme="majorEastAsia" w:hAnsiTheme="majorHAnsi"/>
+      <w:rFonts w:ascii="Calibri" w:cs="Calibri" w:eastAsia="微软雅黑" w:hAnsi="Calibri"/>
+      <w:b/>
       <w:bCs/>
-      <w:i/>
-      <w:color w:themeColor="accent1" w:val="4F81BD"/>
-      <w:sz w:val="24"/>
-      <w:szCs w:val="24"/>
+      <w:color w:val="3F3F3F"/>
+      <w:sz w:val="20"/>
+      <w:szCs w:val="20"/>
     </w:rPr>
   </w:style>
   <w:style w:styleId="Heading5" w:type="paragraph">
-    <w:name w:val="Heading 5"/>
+    <w:name w:val="heading 5"/>
     <w:basedOn w:val="Normal"/>
-    <w:next w:val="BodyText"/>
-    <w:uiPriority w:val="9"/>
-    <w:unhideWhenUsed/>
+    <w:next w:val="Normal"/>
     <w:qFormat/>
     <w:pPr>
       <w:keepNext/>
-      <w:keepLines/>
-      <w:spacing w:after="0" w:before="200"/>
-      <w:outlineLvl w:val="4"/>
+      <w:spacing w:after="60" w:before="220"/>
     </w:pPr>
     <w:rPr>
-      <w:rFonts w:asciiTheme="majorHAnsi" w:cstheme="majorBidi" w:eastAsiaTheme="majorEastAsia" w:hAnsiTheme="majorHAnsi"/>
-      <w:iCs/>
-      <w:color w:themeColor="accent1" w:val="4F81BD"/>
-      <w:sz w:val="24"/>
-      <w:szCs w:val="24"/>
+      <w:rFonts w:ascii="Calibri" w:cs="Calibri" w:eastAsia="微软雅黑" w:hAnsi="Calibri"/>
+      <w:b/>
+      <w:bCs/>
+      <w:color w:val="3F3F3F"/>
+      <w:sz w:val="20"/>
+      <w:szCs w:val="20"/>
     </w:rPr>
   </w:style>
   <w:style w:styleId="Heading6" w:type="paragraph">
-    <w:name w:val="Heading 6"/>
+    <w:name w:val="heading 6"/>
     <w:basedOn w:val="Normal"/>
-    <w:next w:val="BodyText"/>
-    <w:uiPriority w:val="9"/>
-    <w:unhideWhenUsed/>
+    <w:next w:val="Normal"/>
     <w:qFormat/>
     <w:pPr>
       <w:keepNext/>
-      <w:keepLines/>
-      <w:spacing w:after="0" w:before="200"/>
-      <w:outlineLvl w:val="5"/>
+      <w:spacing w:after="60" w:before="220"/>
     </w:pPr>
     <w:rPr>
-      <w:rFonts w:asciiTheme="majorHAnsi" w:cstheme="majorBidi" w:eastAsiaTheme="majorEastAsia" w:hAnsiTheme="majorHAnsi"/>
-      <w:color w:themeColor="accent1" w:val="4F81BD"/>
-      <w:sz w:val="24"/>
-      <w:szCs w:val="24"/>
+      <w:rFonts w:ascii="Calibri" w:cs="Calibri" w:eastAsia="微软雅黑" w:hAnsi="Calibri"/>
+      <w:b/>
+      <w:bCs/>
+      <w:color w:val="3F3F3F"/>
+      <w:sz w:val="20"/>
+      <w:szCs w:val="20"/>
     </w:rPr>
   </w:style>
   <w:style w:styleId="Heading7" w:type="paragraph">
@@ -2010,15 +2307,22 @@
   </w:style>
   <w:style w:styleId="BlockText" w:type="paragraph">
     <w:name w:val="Block Text"/>
-    <w:basedOn w:val="BodyText"/>
-    <w:next w:val="BodyText"/>
-    <w:uiPriority w:val="9"/>
-    <w:unhideWhenUsed/>
+    <w:basedOn w:val="Normal"/>
     <w:qFormat/>
     <w:pPr>
-      <w:spacing w:after="100" w:before="100"/>
-      <w:ind w:firstLine="0" w:left="480" w:right="480"/>
+      <w:spacing w:after="140" w:before="120" w:line="290" w:lineRule="auto"/>
+      <w:pBdr>
+        <w:left w:color="9CC6BE" w:space="10" w:sz="18" w:val="single"/>
+      </w:pBdr>
+      <w:ind w:left="240" w:right="160"/>
+      <w:shd w:color="auto" w:fill="F7F4EC" w:val="clear"/>
     </w:pPr>
+    <w:rPr>
+      <w:rFonts w:ascii="Calibri" w:cs="Calibri" w:eastAsia="微软雅黑" w:hAnsi="Calibri"/>
+      <w:color w:val="333333"/>
+      <w:sz w:val="21"/>
+      <w:szCs w:val="21"/>
+    </w:rPr>
   </w:style>
   <w:style w:styleId="FootnoteText" w:type="paragraph">
     <w:name w:val="Footnote Text"/>
@@ -2094,14 +2398,20 @@
     <w:basedOn w:val="Normal"/>
   </w:style>
   <w:style w:styleId="Caption" w:type="paragraph">
-    <w:name w:val="Caption"/>
+    <w:name w:val="caption"/>
     <w:basedOn w:val="Normal"/>
-    <w:link w:val="BodyTextChar"/>
+    <w:next w:val="Normal"/>
+    <w:qFormat/>
     <w:pPr>
-      <w:spacing w:after="120" w:before="0"/>
+      <w:spacing w:after="200" w:before="60"/>
     </w:pPr>
     <w:rPr>
+      <w:rFonts w:ascii="Calibri" w:cs="Calibri" w:eastAsia="微软雅黑" w:hAnsi="Calibri"/>
       <w:i/>
+      <w:iCs/>
+      <w:color w:val="6E6A60"/>
+      <w:sz w:val="18"/>
+      <w:szCs w:val="18"/>
     </w:rPr>
   </w:style>
   <w:style w:customStyle="1" w:styleId="TableCaption" w:type="paragraph">
@@ -2175,98 +2485,242 @@
       <w:color w:themeColor="accent1" w:themeShade="BF" w:val="365F91"/>
     </w:rPr>
   </w:style>
-  <w:style w:type="paragraph" w:customStyle="1" w:styleId="SourceCode">
+  <w:style w:styleId="Author" w:type="paragraph">
+    <w:name w:val="Author"/>
+    <w:basedOn w:val="Normal"/>
+    <w:next w:val="Normal"/>
+    <w:qFormat/>
+    <w:pPr>
+      <w:spacing w:after="60" w:before="0"/>
+    </w:pPr>
+    <w:rPr>
+      <w:rFonts w:ascii="Calibri" w:cs="Calibri" w:eastAsia="微软雅黑" w:hAnsi="Calibri"/>
+      <w:color w:val="6E6A60"/>
+      <w:sz w:val="18"/>
+      <w:szCs w:val="18"/>
+    </w:rPr>
+  </w:style>
+  <w:style w:styleId="FirstParagraph" w:type="paragraph">
+    <w:name w:val="First Paragraph"/>
+    <w:basedOn w:val="Normal"/>
+    <w:next w:val="Normal"/>
+    <w:qFormat/>
+    <w:pPr>
+      <w:spacing w:after="140" w:before="0" w:line="300" w:lineRule="auto"/>
+    </w:pPr>
+    <w:rPr>
+      <w:rFonts w:ascii="Calibri" w:cs="Calibri" w:eastAsia="微软雅黑" w:hAnsi="Calibri"/>
+      <w:color w:val="1B2A33"/>
+      <w:sz w:val="21"/>
+      <w:szCs w:val="21"/>
+    </w:rPr>
+  </w:style>
+  <w:style w:styleId="Compact" w:type="paragraph">
+    <w:name w:val="Compact"/>
+    <w:basedOn w:val="Normal"/>
+    <w:next w:val="Normal"/>
+    <w:qFormat/>
+    <w:pPr>
+      <w:spacing w:after="20" w:before="0" w:line="290" w:lineRule="auto"/>
+    </w:pPr>
+    <w:rPr>
+      <w:rFonts w:ascii="Calibri" w:cs="Calibri" w:eastAsia="微软雅黑" w:hAnsi="Calibri"/>
+      <w:color w:val="1B2A33"/>
+      <w:sz w:val="21"/>
+      <w:szCs w:val="21"/>
+    </w:rPr>
+  </w:style>
+  <w:style w:styleId="Caption" w:type="paragraph">
+    <w:name w:val="caption"/>
+    <w:basedOn w:val="Normal"/>
+    <w:next w:val="Normal"/>
+    <w:qFormat/>
+    <w:pPr>
+      <w:spacing w:after="200" w:before="60"/>
+    </w:pPr>
+    <w:rPr>
+      <w:rFonts w:ascii="Calibri" w:cs="Calibri" w:eastAsia="微软雅黑" w:hAnsi="Calibri"/>
+      <w:i/>
+      <w:iCs/>
+      <w:color w:val="6E6A60"/>
+      <w:sz w:val="18"/>
+      <w:szCs w:val="18"/>
+    </w:rPr>
+  </w:style>
+  <w:style w:styleId="Caption" w:type="paragraph">
+    <w:name w:val="caption"/>
+    <w:basedOn w:val="Normal"/>
+    <w:next w:val="Normal"/>
+    <w:qFormat/>
+    <w:pPr>
+      <w:spacing w:after="200" w:before="60"/>
+    </w:pPr>
+    <w:rPr>
+      <w:rFonts w:ascii="Calibri" w:cs="Calibri" w:eastAsia="微软雅黑" w:hAnsi="Calibri"/>
+      <w:i/>
+      <w:iCs/>
+      <w:color w:val="6E6A60"/>
+      <w:sz w:val="18"/>
+      <w:szCs w:val="18"/>
+    </w:rPr>
+  </w:style>
+  <w:style w:styleId="SourceCode" w:type="paragraph">
     <w:name w:val="Source Code"/>
     <w:basedOn w:val="Normal"/>
-    <w:link w:val="VerbatimChar"/>
+    <w:qFormat/>
     <w:pPr>
-      <w:wordWrap w:val="off"/>
+      <w:spacing w:after="80" w:before="80" w:line="260" w:lineRule="auto"/>
+      <w:shd w:color="auto" w:fill="F7F4EC" w:val="clear"/>
+      <w:pBdr>
+        <w:left w:color="9CC6BE" w:space="8" w:sz="18" w:val="single"/>
+      </w:pBdr>
+      <w:ind w:left="120" w:right="120"/>
     </w:pPr>
+    <w:rPr>
+      <w:rFonts w:ascii="Consolas" w:cs="Consolas" w:eastAsia="Consolas" w:hAnsi="Consolas"/>
+      <w:color w:val="242424"/>
+      <w:sz w:val="18"/>
+      <w:szCs w:val="18"/>
+    </w:rPr>
+  </w:style>
+  <w:style w:styleId="VerbatimChar" w:type="character">
+    <w:name w:val="Verbatim Char"/>
+    <w:basedOn w:val="DefaultParagraphFont"/>
+    <w:rPr>
+      <w:rFonts w:ascii="Consolas" w:cs="Consolas" w:eastAsia="Consolas" w:hAnsi="Consolas"/>
+      <w:color w:val="242424"/>
+      <w:sz w:val="19"/>
+      <w:szCs w:val="19"/>
+    </w:rPr>
+  </w:style>
+  <w:style w:styleId="Table" w:type="table">
+    <w:name w:val="Table"/>
+    <w:qFormat/>
+    <w:tblPr>
+      <w:tblBorders>
+        <w:top w:color="D3CCBB" w:sz="8" w:val="single"/>
+        <w:bottom w:color="D3CCBB" w:sz="8" w:val="single"/>
+        <w:insideH w:color="E7E2D6" w:sz="4" w:val="single"/>
+        <w:left w:sz="0" w:val="none"/>
+        <w:right w:sz="0" w:val="none"/>
+        <w:insideV w:sz="0" w:val="none"/>
+      </w:tblBorders>
+      <w:tblCellMar>
+        <w:top w:type="dxa" w:w="90"/>
+        <w:bottom w:type="dxa" w:w="90"/>
+        <w:left w:type="dxa" w:w="120"/>
+        <w:right w:type="dxa" w:w="120"/>
+      </w:tblCellMar>
+    </w:tblPr>
+    <w:tblStylePr w:type="firstRow">
+      <w:rPr>
+        <w:rFonts w:ascii="Calibri" w:cs="Calibri" w:eastAsia="微软雅黑" w:hAnsi="Calibri"/>
+        <w:b/>
+        <w:bCs/>
+        <w:color w:val="1B2A33"/>
+        <w:sz w:val="19"/>
+        <w:szCs w:val="19"/>
+      </w:rPr>
+      <w:tcPr>
+        <w:shd w:color="auto" w:fill="F2EEE3" w:val="clear"/>
+      </w:tcPr>
+    </w:tblStylePr>
   </w:style>
   <w:style w:type="character" w:customStyle="1" w:styleId="KeywordTok">
     <w:name w:val="KeywordTok"/>
     <w:basedOn w:val="VerbatimChar"/>
     <w:rPr>
       <w:b/>
-      <w:color w:val="007020"/>
+      <w:color w:val="204a87"/>
+      <w:shd w:val="clear" w:fill="f8f8f8"/>
     </w:rPr>
   </w:style>
   <w:style w:type="character" w:customStyle="1" w:styleId="DataTypeTok">
     <w:name w:val="DataTypeTok"/>
     <w:basedOn w:val="VerbatimChar"/>
     <w:rPr>
-      <w:color w:val="902000"/>
+      <w:color w:val="204a87"/>
+      <w:shd w:val="clear" w:fill="f8f8f8"/>
     </w:rPr>
   </w:style>
   <w:style w:type="character" w:customStyle="1" w:styleId="DecValTok">
     <w:name w:val="DecValTok"/>
     <w:basedOn w:val="VerbatimChar"/>
     <w:rPr>
-      <w:color w:val="40a070"/>
+      <w:color w:val="0000cf"/>
+      <w:shd w:val="clear" w:fill="f8f8f8"/>
     </w:rPr>
   </w:style>
   <w:style w:type="character" w:customStyle="1" w:styleId="BaseNTok">
     <w:name w:val="BaseNTok"/>
     <w:basedOn w:val="VerbatimChar"/>
     <w:rPr>
-      <w:color w:val="40a070"/>
+      <w:color w:val="0000cf"/>
+      <w:shd w:val="clear" w:fill="f8f8f8"/>
     </w:rPr>
   </w:style>
   <w:style w:type="character" w:customStyle="1" w:styleId="FloatTok">
     <w:name w:val="FloatTok"/>
     <w:basedOn w:val="VerbatimChar"/>
     <w:rPr>
-      <w:color w:val="40a070"/>
+      <w:color w:val="0000cf"/>
+      <w:shd w:val="clear" w:fill="f8f8f8"/>
     </w:rPr>
   </w:style>
   <w:style w:type="character" w:customStyle="1" w:styleId="ConstantTok">
     <w:name w:val="ConstantTok"/>
     <w:basedOn w:val="VerbatimChar"/>
     <w:rPr>
-      <w:color w:val="880000"/>
+      <w:color w:val="8f5902"/>
+      <w:shd w:val="clear" w:fill="f8f8f8"/>
     </w:rPr>
   </w:style>
   <w:style w:type="character" w:customStyle="1" w:styleId="CharTok">
     <w:name w:val="CharTok"/>
     <w:basedOn w:val="VerbatimChar"/>
     <w:rPr>
-      <w:color w:val="4070a0"/>
+      <w:color w:val="4e9a06"/>
+      <w:shd w:val="clear" w:fill="f8f8f8"/>
     </w:rPr>
   </w:style>
   <w:style w:type="character" w:customStyle="1" w:styleId="SpecialCharTok">
     <w:name w:val="SpecialCharTok"/>
     <w:basedOn w:val="VerbatimChar"/>
     <w:rPr>
-      <w:color w:val="4070a0"/>
+      <w:b/>
+      <w:color w:val="ce5c00"/>
+      <w:shd w:val="clear" w:fill="f8f8f8"/>
     </w:rPr>
   </w:style>
   <w:style w:type="character" w:customStyle="1" w:styleId="StringTok">
     <w:name w:val="StringTok"/>
     <w:basedOn w:val="VerbatimChar"/>
     <w:rPr>
-      <w:color w:val="4070a0"/>
+      <w:color w:val="4e9a06"/>
+      <w:shd w:val="clear" w:fill="f8f8f8"/>
     </w:rPr>
   </w:style>
   <w:style w:type="character" w:customStyle="1" w:styleId="VerbatimStringTok">
     <w:name w:val="VerbatimStringTok"/>
     <w:basedOn w:val="VerbatimChar"/>
     <w:rPr>
-      <w:color w:val="4070a0"/>
+      <w:color w:val="4e9a06"/>
+      <w:shd w:val="clear" w:fill="f8f8f8"/>
     </w:rPr>
   </w:style>
   <w:style w:type="character" w:customStyle="1" w:styleId="SpecialStringTok">
     <w:name w:val="SpecialStringTok"/>
     <w:basedOn w:val="VerbatimChar"/>
     <w:rPr>
-      <w:color w:val="bb6688"/>
+      <w:color w:val="4e9a06"/>
+      <w:shd w:val="clear" w:fill="f8f8f8"/>
     </w:rPr>
   </w:style>
   <w:style w:type="character" w:customStyle="1" w:styleId="ImportTok">
     <w:name w:val="ImportTok"/>
     <w:basedOn w:val="VerbatimChar"/>
     <w:rPr>
-      <w:b/>
-      <w:color w:val="008000"/>
+      <w:shd w:val="clear" w:fill="f8f8f8"/>
     </w:rPr>
   </w:style>
   <w:style w:type="character" w:customStyle="1" w:styleId="CommentTok">
@@ -2274,15 +2728,18 @@
     <w:basedOn w:val="VerbatimChar"/>
     <w:rPr>
       <w:i/>
-      <w:color w:val="60a0b0"/>
+      <w:color w:val="8f5902"/>
+      <w:shd w:val="clear" w:fill="f8f8f8"/>
     </w:rPr>
   </w:style>
   <w:style w:type="character" w:customStyle="1" w:styleId="DocumentationTok">
     <w:name w:val="DocumentationTok"/>
     <w:basedOn w:val="VerbatimChar"/>
     <w:rPr>
+      <w:b/>
       <w:i/>
-      <w:color w:val="ba2121"/>
+      <w:color w:val="8f5902"/>
+      <w:shd w:val="clear" w:fill="f8f8f8"/>
     </w:rPr>
   </w:style>
   <w:style w:type="character" w:customStyle="1" w:styleId="AnnotationTok">
@@ -2291,7 +2748,8 @@
     <w:rPr>
       <w:b/>
       <w:i/>
-      <w:color w:val="60a0b0"/>
+      <w:color w:val="8f5902"/>
+      <w:shd w:val="clear" w:fill="f8f8f8"/>
     </w:rPr>
   </w:style>
   <w:style w:type="character" w:customStyle="1" w:styleId="CommentVarTok">
@@ -2300,28 +2758,33 @@
     <w:rPr>
       <w:b/>
       <w:i/>
-      <w:color w:val="60a0b0"/>
+      <w:color w:val="8f5902"/>
+      <w:shd w:val="clear" w:fill="f8f8f8"/>
     </w:rPr>
   </w:style>
   <w:style w:type="character" w:customStyle="1" w:styleId="OtherTok">
     <w:name w:val="OtherTok"/>
     <w:basedOn w:val="VerbatimChar"/>
     <w:rPr>
-      <w:color w:val="007020"/>
+      <w:color w:val="8f5902"/>
+      <w:shd w:val="clear" w:fill="f8f8f8"/>
     </w:rPr>
   </w:style>
   <w:style w:type="character" w:customStyle="1" w:styleId="FunctionTok">
     <w:name w:val="FunctionTok"/>
     <w:basedOn w:val="VerbatimChar"/>
     <w:rPr>
-      <w:color w:val="06287e"/>
+      <w:b/>
+      <w:color w:val="204a87"/>
+      <w:shd w:val="clear" w:fill="f8f8f8"/>
     </w:rPr>
   </w:style>
   <w:style w:type="character" w:customStyle="1" w:styleId="VariableTok">
     <w:name w:val="VariableTok"/>
     <w:basedOn w:val="VerbatimChar"/>
     <w:rPr>
-      <w:color w:val="19177c"/>
+      <w:color w:val="000000"/>
+      <w:shd w:val="clear" w:fill="f8f8f8"/>
     </w:rPr>
   </w:style>
   <w:style w:type="character" w:customStyle="1" w:styleId="ControlFlowTok">
@@ -2329,46 +2792,56 @@
     <w:basedOn w:val="VerbatimChar"/>
     <w:rPr>
       <w:b/>
-      <w:color w:val="007020"/>
+      <w:color w:val="204a87"/>
+      <w:shd w:val="clear" w:fill="f8f8f8"/>
     </w:rPr>
   </w:style>
   <w:style w:type="character" w:customStyle="1" w:styleId="OperatorTok">
     <w:name w:val="OperatorTok"/>
     <w:basedOn w:val="VerbatimChar"/>
     <w:rPr>
-      <w:color w:val="666666"/>
+      <w:b/>
+      <w:color w:val="ce5c00"/>
+      <w:shd w:val="clear" w:fill="f8f8f8"/>
     </w:rPr>
   </w:style>
   <w:style w:type="character" w:customStyle="1" w:styleId="BuiltInTok">
     <w:name w:val="BuiltInTok"/>
     <w:basedOn w:val="VerbatimChar"/>
     <w:rPr>
-      <w:color w:val="008000"/>
+      <w:shd w:val="clear" w:fill="f8f8f8"/>
     </w:rPr>
   </w:style>
   <w:style w:type="character" w:customStyle="1" w:styleId="ExtensionTok">
     <w:name w:val="ExtensionTok"/>
     <w:basedOn w:val="VerbatimChar"/>
-    <w:rPr/>
+    <w:rPr>
+      <w:shd w:val="clear" w:fill="f8f8f8"/>
+    </w:rPr>
   </w:style>
   <w:style w:type="character" w:customStyle="1" w:styleId="PreprocessorTok">
     <w:name w:val="PreprocessorTok"/>
     <w:basedOn w:val="VerbatimChar"/>
     <w:rPr>
-      <w:color w:val="bc7a00"/>
+      <w:i/>
+      <w:color w:val="8f5902"/>
+      <w:shd w:val="clear" w:fill="f8f8f8"/>
     </w:rPr>
   </w:style>
   <w:style w:type="character" w:customStyle="1" w:styleId="AttributeTok">
     <w:name w:val="AttributeTok"/>
     <w:basedOn w:val="VerbatimChar"/>
     <w:rPr>
-      <w:color w:val="7d9029"/>
+      <w:color w:val="204a87"/>
+      <w:shd w:val="clear" w:fill="f8f8f8"/>
     </w:rPr>
   </w:style>
   <w:style w:type="character" w:customStyle="1" w:styleId="RegionMarkerTok">
     <w:name w:val="RegionMarkerTok"/>
     <w:basedOn w:val="VerbatimChar"/>
-    <w:rPr/>
+    <w:rPr>
+      <w:shd w:val="clear" w:fill="f8f8f8"/>
+    </w:rPr>
   </w:style>
   <w:style w:type="character" w:customStyle="1" w:styleId="InformationTok">
     <w:name w:val="InformationTok"/>
@@ -2376,7 +2849,8 @@
     <w:rPr>
       <w:b/>
       <w:i/>
-      <w:color w:val="60a0b0"/>
+      <w:color w:val="8f5902"/>
+      <w:shd w:val="clear" w:fill="f8f8f8"/>
     </w:rPr>
   </w:style>
   <w:style w:type="character" w:customStyle="1" w:styleId="WarningTok">
@@ -2385,15 +2859,16 @@
     <w:rPr>
       <w:b/>
       <w:i/>
-      <w:color w:val="60a0b0"/>
+      <w:color w:val="8f5902"/>
+      <w:shd w:val="clear" w:fill="f8f8f8"/>
     </w:rPr>
   </w:style>
   <w:style w:type="character" w:customStyle="1" w:styleId="AlertTok">
     <w:name w:val="AlertTok"/>
     <w:basedOn w:val="VerbatimChar"/>
     <w:rPr>
-      <w:b/>
-      <w:color w:val="ff0000"/>
+      <w:color w:val="ef2929"/>
+      <w:shd w:val="clear" w:fill="f8f8f8"/>
     </w:rPr>
   </w:style>
   <w:style w:type="character" w:customStyle="1" w:styleId="ErrorTok">
@@ -2401,13 +2876,16 @@
     <w:basedOn w:val="VerbatimChar"/>
     <w:rPr>
       <w:b/>
-      <w:color w:val="ff0000"/>
+      <w:color w:val="a40000"/>
+      <w:shd w:val="clear" w:fill="f8f8f8"/>
     </w:rPr>
   </w:style>
   <w:style w:type="character" w:customStyle="1" w:styleId="NormalTok">
     <w:name w:val="NormalTok"/>
     <w:basedOn w:val="VerbatimChar"/>
-    <w:rPr/>
+    <w:rPr>
+      <w:shd w:val="clear" w:fill="f8f8f8"/>
+    </w:rPr>
   </w:style>
 </w:styles>
 </file>

</xml_diff>

<commit_message>
site: sync 2026-10-20 18:01
</commit_message>
<xml_diff>
--- a/documents/files/analysis.docx
+++ b/documents/files/analysis.docx
@@ -23,7 +23,7 @@
         <w:pStyle w:val="Date"/>
       </w:pPr>
       <w:r>
-        <w:t xml:space="preserve">2026-10-19</w:t>
+        <w:t xml:space="preserve">2026-10-20</w:t>
       </w:r>
     </w:p>
     <w:p>
@@ -1008,15 +1008,211 @@
           </w:p>
         </w:tc>
       </w:tr>
+      <w:tr>
+        <w:tc>
+          <w:tcPr>
+            <w:tcW w:w="2424" w:type="dxa"/>
+          </w:tcPr>
+          <w:p>
+            <w:pPr>
+              <w:pStyle w:val="Compact"/>
+              <w:jc w:val="left"/>
+            </w:pPr>
+            <w:r>
+              <w:rPr>
+                <w:rStyle w:val="VerbatimChar"/>
+              </w:rPr>
+              <w:t xml:space="preserve">a3_s5_p50k_e25</w:t>
+            </w:r>
+          </w:p>
+        </w:tc>
+        <w:tc>
+          <w:tcPr>
+            <w:tcW w:w="2946" w:type="dxa"/>
+          </w:tcPr>
+          <w:p>
+            <w:pPr>
+              <w:pStyle w:val="Compact"/>
+              <w:jc w:val="left"/>
+            </w:pPr>
+            <w:r>
+              <w:t xml:space="preserve">Ascend910 · 5 blocks · 50k/ep · 25 ep</w:t>
+            </w:r>
+          </w:p>
+        </w:tc>
+        <w:tc>
+          <w:tcPr>
+            <w:tcW w:w="1008" w:type="dxa"/>
+          </w:tcPr>
+          <w:p>
+            <w:pPr>
+              <w:pStyle w:val="Compact"/>
+              <w:jc w:val="right"/>
+            </w:pPr>
+            <w:r>
+              <w:t xml:space="preserve">0.7289</w:t>
+            </w:r>
+          </w:p>
+        </w:tc>
+        <w:tc>
+          <w:tcPr>
+            <w:tcW w:w="1008" w:type="dxa"/>
+          </w:tcPr>
+          <w:p>
+            <w:pPr>
+              <w:pStyle w:val="Compact"/>
+              <w:jc w:val="right"/>
+            </w:pPr>
+            <w:r>
+              <w:t xml:space="preserve">0.7496</w:t>
+            </w:r>
+          </w:p>
+        </w:tc>
+        <w:tc>
+          <w:tcPr>
+            <w:tcW w:w="1008" w:type="dxa"/>
+          </w:tcPr>
+          <w:p>
+            <w:pPr>
+              <w:pStyle w:val="Compact"/>
+              <w:jc w:val="right"/>
+            </w:pPr>
+            <w:r>
+              <w:t xml:space="preserve">0.7887</w:t>
+            </w:r>
+          </w:p>
+        </w:tc>
+        <w:tc>
+          <w:tcPr>
+            <w:tcW w:w="1244" w:type="dxa"/>
+          </w:tcPr>
+          <w:p>
+            <w:pPr>
+              <w:pStyle w:val="Compact"/>
+              <w:jc w:val="right"/>
+            </w:pPr>
+            <w:r>
+              <w:t xml:space="preserve">48.2 min</w:t>
+            </w:r>
+          </w:p>
+        </w:tc>
+      </w:tr>
+      <w:tr>
+        <w:tc>
+          <w:tcPr>
+            <w:tcW w:w="2424" w:type="dxa"/>
+          </w:tcPr>
+          <w:p>
+            <w:pPr>
+              <w:pStyle w:val="Compact"/>
+              <w:jc w:val="left"/>
+            </w:pPr>
+            <w:r>
+              <w:rPr>
+                <w:rStyle w:val="VerbatimChar"/>
+                <w:b/>
+                <w:bCs/>
+              </w:rPr>
+              <w:t xml:space="preserve">a3_b10_p200k_e60</w:t>
+            </w:r>
+          </w:p>
+        </w:tc>
+        <w:tc>
+          <w:tcPr>
+            <w:tcW w:w="2946" w:type="dxa"/>
+          </w:tcPr>
+          <w:p>
+            <w:pPr>
+              <w:pStyle w:val="Compact"/>
+              <w:jc w:val="left"/>
+            </w:pPr>
+            <w:r>
+              <w:rPr>
+                <w:b/>
+                <w:bCs/>
+              </w:rPr>
+              <w:t xml:space="preserve">Ascend910 · 10 blocks · 200k/ep · 60 ep</w:t>
+            </w:r>
+          </w:p>
+        </w:tc>
+        <w:tc>
+          <w:tcPr>
+            <w:tcW w:w="1008" w:type="dxa"/>
+          </w:tcPr>
+          <w:p>
+            <w:pPr>
+              <w:pStyle w:val="Compact"/>
+              <w:jc w:val="right"/>
+            </w:pPr>
+            <w:r>
+              <w:rPr>
+                <w:b/>
+                <w:bCs/>
+              </w:rPr>
+              <w:t xml:space="preserve">0.7815</w:t>
+            </w:r>
+          </w:p>
+        </w:tc>
+        <w:tc>
+          <w:tcPr>
+            <w:tcW w:w="1008" w:type="dxa"/>
+          </w:tcPr>
+          <w:p>
+            <w:pPr>
+              <w:pStyle w:val="Compact"/>
+              <w:jc w:val="right"/>
+            </w:pPr>
+            <w:r>
+              <w:rPr>
+                <w:b/>
+                <w:bCs/>
+              </w:rPr>
+              <w:t xml:space="preserve">0.7931</w:t>
+            </w:r>
+          </w:p>
+        </w:tc>
+        <w:tc>
+          <w:tcPr>
+            <w:tcW w:w="1008" w:type="dxa"/>
+          </w:tcPr>
+          <w:p>
+            <w:pPr>
+              <w:pStyle w:val="Compact"/>
+              <w:jc w:val="right"/>
+            </w:pPr>
+            <w:r>
+              <w:rPr>
+                <w:b/>
+                <w:bCs/>
+              </w:rPr>
+              <w:t xml:space="preserve">0.8241</w:t>
+            </w:r>
+          </w:p>
+        </w:tc>
+        <w:tc>
+          <w:tcPr>
+            <w:tcW w:w="1244" w:type="dxa"/>
+          </w:tcPr>
+          <w:p>
+            <w:pPr>
+              <w:pStyle w:val="Compact"/>
+              <w:jc w:val="right"/>
+            </w:pPr>
+            <w:r>
+              <w:t xml:space="preserve">425 min</w:t>
+            </w:r>
+          </w:p>
+        </w:tc>
+      </w:tr>
     </w:tbl>
     <w:bookmarkEnd w:id="21"/>
-    <w:bookmarkStart w:id="22" w:name="三条结论"/>
+    <w:bookmarkStart w:id="22" w:name="五条结论"/>
     <w:p>
       <w:pPr>
         <w:pStyle w:val="Heading2"/>
       </w:pPr>
       <w:r>
-        <w:t xml:space="preserve">三条结论</w:t>
+        <w:t xml:space="preserve">五条结论</w:t>
       </w:r>
     </w:p>
     <w:p>
@@ -1104,10 +1300,52 @@
           <w:b/>
           <w:bCs/>
         </w:rPr>
-        <w:t xml:space="preserve">10 blocks 在第 15 轮后基本饱和</w:t>
-      </w:r>
-      <w:r>
-        <w:t xml:space="preserve">：从 15 轮拉到 25 轮，L=9 只涨 0.0034、L=121 只涨 0.0025，耗时却从 7.9 min 变 14.6 min。要再提升应换方向（15 blocks 或重标定学习率日程），而不是继续加 epoch。</w:t>
+        <w:t xml:space="preserve">「饱和」取决于总呈现量，不是 epoch 数</w:t>
+      </w:r>
+      <w:r>
+        <w:t xml:space="preserve">。此前 10 blocks 在 10k/epoch 下从 15 轮加到 25 轮只涨 0.003，看起来饱和；但把每轮样本提到 200k 后，同样 10 blocks 在 60 轮里把 L=121 从 0.7941 推到</w:t>
+      </w:r>
+      <w:r>
+        <w:t xml:space="preserve"> </w:t>
+      </w:r>
+      <w:r>
+        <w:rPr>
+          <w:b/>
+          <w:bCs/>
+        </w:rPr>
+        <w:t xml:space="preserve">0.8241</w:t>
+      </w:r>
+      <w:r>
+        <w:t xml:space="preserve">（+0.030）、L=9 从 0.7460 推到 0.7815。此前判断是「数据量不足」造成的假饱和。</w:t>
+      </w:r>
+    </w:p>
+    <w:p>
+      <w:pPr>
+        <w:pStyle w:val="Compact"/>
+        <w:numPr>
+          <w:ilvl w:val="0"/>
+          <w:numId w:val="1001"/>
+        </w:numPr>
+      </w:pPr>
+      <w:r>
+        <w:rPr>
+          <w:b/>
+          <w:bCs/>
+        </w:rPr>
+        <w:t xml:space="preserve">P2 自身已饱和</w:t>
+      </w:r>
+      <w:r>
+        <w:t xml:space="preserve">：ep36 首次降 LR 后仅 +0.0015，ep51 第二次降 LR 后 +0.0002，ep55 达峰。再堆 epoch 无收益，下一步只能加宽/加深网络，或改变数据分布。与论文仍差 0.14–0.17，主因是呈现量 1,200 万 vs 3.71 亿（</w:t>
+      </w:r>
+      <w:r>
+        <w:rPr>
+          <w:b/>
+          <w:bCs/>
+        </w:rPr>
+        <w:t xml:space="preserve">3.2%</w:t>
+      </w:r>
+      <w:r>
+        <w:t xml:space="preserve">）。</w:t>
       </w:r>
     </w:p>
     <w:bookmarkEnd w:id="22"/>

</xml_diff>